<commit_message>
Fecha roteiros de anuncio e videos de feed da Jornada AME-SE
Versao final aprovada pela Amanda: 5 roteiros de anuncio pago (anuncios
1-2 mantem misterio sobre ser curso, anuncios 3-5 falam abertamente) e
3 videos organicos para o Feed com CTA de comentario de palavra-chave
para ativar a automacao Youze (topo, meio e fundo de funil). Adiciona
legenda e sugestao de cenario de gravacao pra cada um dos 8 videos,
renomeia a secao de "calendario de rotacao" para "calendario de
anuncios", e remove travessoes remanescentes dos titulos.

Co-Authored-By: Claude Sonnet 5 <noreply@anthropic.com>
</commit_message>
<xml_diff>
--- a/camila-sartori/exports/roteiros-e-calendario-anuncios.docx
+++ b/camila-sartori/exports/roteiros-e-calendario-anuncios.docx
@@ -12,7 +12,7 @@
           <w:color w:val="6E0E3D"/>
           <w:sz w:val="40"/>
         </w:rPr>
-        <w:t>Roteiros de Vídeo para Anúncio + Calendário de Rotação — Jornada AME-SE</w:t>
+        <w:t>Roteiros de Vídeo para Anúncio e Vídeos de Feed da Jornada AME-SE</w:t>
       </w:r>
     </w:p>
     <w:p>
@@ -43,35 +43,7 @@
           <w:b w:val="0"/>
           <w:sz w:val="22"/>
         </w:rPr>
-        <w:t xml:space="preserve">5 vídeos falados direto pra câmera pela Camila, </w:t>
-      </w:r>
-      <w:r>
-        <w:rPr>
-          <w:b/>
-          <w:sz w:val="22"/>
-        </w:rPr>
-        <w:t>até 2 minutos cada</w:t>
-      </w:r>
-      <w:r>
-        <w:rPr>
-          <w:b w:val="0"/>
-          <w:sz w:val="22"/>
-        </w:rPr>
-        <w:t xml:space="preserve">, formato vertical (9:16) — funcionam em Stories e Reels ads, e o mesmo vídeo pode ser reaproveitado depois em anúncio de Feed. Cada um parte de uma dor bem específica e concreta (não uma dor genérica), liga essa dor a um padrão que a terapia do esquema e a TCC explicam, mostra o desejo do outro lado, e só depois apresenta a Camila e o curso. Todos terminam com o mesmo CTA verbal: </w:t>
-      </w:r>
-      <w:r>
-        <w:rPr>
-          <w:b/>
-          <w:sz w:val="22"/>
-        </w:rPr>
-        <w:t>"Pra conhecer mais sobre o curso, clique no botão que vai aparecer na sua tela."</w:t>
-      </w:r>
-      <w:r>
-        <w:rPr>
-          <w:b w:val="0"/>
-          <w:sz w:val="22"/>
-        </w:rPr>
-        <w:t xml:space="preserve"> — não falar "link na bio", porque esse mesmo vídeo pode rodar em formatos que não têm bio (Feed, por exemplo).</w:t>
+        <w:t>8 vídeos falados direto para a câmera pela Camila, formato vertical (9:16): 5 para anúncio pago (até 2 minutos cada) e 3 para o Feed orgânico, com CTA de comentário para ativar a automação Youze. Cada roteiro parte de uma dor específica e concreta, liga essa dor a um padrão explicado pela terapia do esquema e pela TCC, mostra o desejo do outro lado, e só depois apresenta a Camila.</w:t>
       </w:r>
     </w:p>
     <w:p>
@@ -80,28 +52,46 @@
           <w:b/>
           <w:sz w:val="22"/>
         </w:rPr>
-        <w:t>Importante sobre a credencial:</w:t>
+        <w:t>Sobre a credencial:</w:t>
       </w:r>
       <w:r>
         <w:rPr>
           <w:b w:val="0"/>
           <w:sz w:val="22"/>
         </w:rPr>
-        <w:t xml:space="preserve"> é </w:t>
+        <w:t xml:space="preserve"> sempre "mais de três mil horas de atendimento", nunca "três mil atendimentos".</w:t>
       </w:r>
+    </w:p>
+    <w:p>
       <w:r>
         <w:rPr>
           <w:b/>
           <w:sz w:val="22"/>
         </w:rPr>
-        <w:t>"mais de três mil horas de atendimento"</w:t>
+        <w:t>Sobre falar do curso:</w:t>
       </w:r>
       <w:r>
         <w:rPr>
           <w:b w:val="0"/>
           <w:sz w:val="22"/>
         </w:rPr>
-        <w:t>, não "três mil atendimentos" — a Camila pediu pra reforçar essa correção em todos os materiais.</w:t>
+        <w:t xml:space="preserve"> nos Anúncios 1 e 2, manter o mistério (fala em "um passo a passo", sem citar "curso"). Nos Anúncios 3, 4 e 5, pode falar abertamente que é um curso.</w:t>
+      </w:r>
+    </w:p>
+    <w:p>
+      <w:r>
+        <w:rPr>
+          <w:b/>
+          <w:sz w:val="22"/>
+        </w:rPr>
+        <w:t>Sobre o cenário de gravação:</w:t>
+      </w:r>
+      <w:r>
+        <w:rPr>
+          <w:b w:val="0"/>
+          <w:sz w:val="22"/>
+        </w:rPr>
+        <w:t xml:space="preserve"> nada aqui está escrito em pedra, são só sugestões para testar se o público dela responde melhor a vídeo parado ou em movimento. Se a Camila não conseguir seguir à risca, pode gravar sentada ou em pé, do jeito que for mais prático naquele momento, desde que tenha boa iluminação e bom áudio.</w:t>
       </w:r>
     </w:p>
     <w:p>
@@ -122,7 +112,7 @@
           <w:color w:val="6E0E3D"/>
           <w:sz w:val="30"/>
         </w:rPr>
-        <w:t>Anúncio 1 — Ciúme e relacionamentos que não duram</w:t>
+        <w:t>Anúncio 1: Ciúme e relacionamentos que não duram</w:t>
       </w:r>
     </w:p>
     <w:p>
@@ -131,14 +121,23 @@
           <w:b/>
           <w:sz w:val="22"/>
         </w:rPr>
-        <w:t>Dor:</w:t>
+        <w:t>Cenário sugerido:</w:t>
       </w:r>
       <w:r>
         <w:rPr>
           <w:b w:val="0"/>
           <w:sz w:val="22"/>
         </w:rPr>
-        <w:t xml:space="preserve"> apego inseguro, ciúme, relacionamentos que terminam por causa disso.</w:t>
+        <w:t xml:space="preserve"> sentada em uma poltrona do consultório, olhando direto para a câmera, mãos apoiadas no colo. Tom mais intimista, quase uma conversa em consultório.</w:t>
+      </w:r>
+    </w:p>
+    <w:p>
+      <w:r>
+        <w:rPr>
+          <w:b/>
+          <w:sz w:val="22"/>
+        </w:rPr>
+        <w:t>Roteiro:</w:t>
       </w:r>
     </w:p>
     <w:p>
@@ -150,7 +149,7 @@
           <w:b w:val="0"/>
           <w:sz w:val="24"/>
         </w:rPr>
-        <w:t>"Você já perdeu um relacionamento por causa do ciúme e continua sem entender por quê? Você sente que ama demais, mas na verdade vive controlando, cobrando, se sentindo insegura o tempo todo, com medo de ser abandonada de novo? Isso não é 'amar demais'. Isso tem nome: é um padrão de apego que se formou muito antes desse relacionamento, provavelmente na sua infância. E ele vai continuar se repetindo, com pessoas diferentes, até você entender de onde ele vem.</w:t>
+        <w:t>"Você ama muito o seu parceiro, mas na prática se pega controlando, cobrando, se sentindo insegura o tempo todo, com medo de ser abandonada? Isso não é 'amar demais'. Isso tem nome: é um padrão de apego que pode ter se formado muito antes desse relacionamento, provavelmente na sua infância. E se você não analisar e concluir esse padrão, ele poderá continuar se repetindo, com pessoas diferentes, até você entender de onde ele vem. E chega de términos por conta disso, né?</w:t>
       </w:r>
     </w:p>
     <w:p>
@@ -171,7 +170,7 @@
           <w:b w:val="0"/>
           <w:sz w:val="24"/>
         </w:rPr>
-        <w:t>Imagina se relacionar sem esse aperto no peito. Confiar sem precisar controlar. Ficar sozinha sem se sentir desesperada. Isso é possível.</w:t>
+        <w:t>Agora, imagine se relacionar sem esse aperto no peito. Confiar sem precisar controlar. Ficar sozinha sem se sentir desesperada. Isso é possível.</w:t>
       </w:r>
     </w:p>
     <w:p>
@@ -192,7 +191,7 @@
           <w:b w:val="0"/>
           <w:sz w:val="24"/>
         </w:rPr>
-        <w:t>Eu sou psicóloga desde 2018, já são mais de três mil horas de atendimento, e criei a Jornada AME-SE com tudo que eu aplico na prática clínica, baseado em terapia do esquema e terapia cognitivo-comportamental, pra te ajudar a entender e quebrar esse padrão.</w:t>
+        <w:t>Muito prazer, me chamo Camila Sartori, psicóloga desde 2018, com mais de três mil horas de atendimento. Com base em toda experiência que adquiri nesses quase 10 anos de profissão, desenvolvi um passo a passo com tudo que eu aplico na prática clínica, baseado em terapia do esquema e terapia cognitivo-comportamental, para ajudar mulheres como você a entender e quebrar esse padrão.</w:t>
       </w:r>
     </w:p>
     <w:p>
@@ -213,7 +212,31 @@
           <w:b w:val="0"/>
           <w:sz w:val="24"/>
         </w:rPr>
-        <w:t>Pra conhecer mais sobre o curso, clique no botão que vai aparecer na sua tela."</w:t>
+        <w:t>Para saber mais, toque no botão que vai aparecer na sua tela."</w:t>
+      </w:r>
+    </w:p>
+    <w:p>
+      <w:r>
+        <w:rPr>
+          <w:b/>
+          <w:sz w:val="22"/>
+        </w:rPr>
+        <w:t>Legenda:</w:t>
+      </w:r>
+      <w:r>
+        <w:rPr>
+          <w:b w:val="0"/>
+          <w:sz w:val="22"/>
+        </w:rPr>
+        <w:t xml:space="preserve"> Ciúme não é sinônimo de amor. Entenda de onde vem esse padrão e como quebrá-lo. Toque no botão para saber mais.</w:t>
+      </w:r>
+    </w:p>
+    <w:p>
+      <w:r>
+        <w:rPr>
+          <w:color w:val="CCCCCC"/>
+        </w:rPr>
+        <w:t>____________________________________________________________</w:t>
       </w:r>
     </w:p>
     <w:p>
@@ -226,7 +249,7 @@
           <w:color w:val="6E0E3D"/>
           <w:sz w:val="30"/>
         </w:rPr>
-        <w:t>Anúncio 2 — Solidão e medo de se conectar</w:t>
+        <w:t>Anúncio 2: Solidão e medo de se conectar</w:t>
       </w:r>
     </w:p>
     <w:p>
@@ -235,14 +258,23 @@
           <w:b/>
           <w:sz w:val="22"/>
         </w:rPr>
-        <w:t>Dor:</w:t>
+        <w:t>Cenário sugerido:</w:t>
       </w:r>
       <w:r>
         <w:rPr>
           <w:b w:val="0"/>
           <w:sz w:val="22"/>
         </w:rPr>
-        <w:t xml:space="preserve"> se afastar/sabotar relações antes de ser machucada, terminar sempre sozinha.</w:t>
+        <w:t xml:space="preserve"> caminhando devagar por um corredor da clínica, olhando para a câmera enquanto anda.</w:t>
+      </w:r>
+    </w:p>
+    <w:p>
+      <w:r>
+        <w:rPr>
+          <w:b/>
+          <w:sz w:val="22"/>
+        </w:rPr>
+        <w:t>Roteiro:</w:t>
       </w:r>
     </w:p>
     <w:p>
@@ -275,7 +307,7 @@
           <w:b w:val="0"/>
           <w:sz w:val="24"/>
         </w:rPr>
-        <w:t>Não tem nada de errado com você. Isso é um mecanismo de proteção que você aprendeu a usar em algum momento da sua vida, provavelmente porque alguém que deveria cuidar de você, não cuidou do jeito que você precisava. E esse mecanismo, hoje, tá te afastando exatamente do que você mais quer: se sentir segura pra amar e ser amada.</w:t>
+        <w:t>Não tem nada de errado com você. Isso é um mecanismo de proteção que você aprendeu a usar em algum momento da sua vida, provavelmente porque alguém que deveria cuidar de você não cuidou do jeito que você precisava. E esse mecanismo, hoje, está te afastando exatamente do que você mais quer: se sentir segura para amar e ser amada.</w:t>
       </w:r>
     </w:p>
     <w:p>
@@ -296,7 +328,7 @@
           <w:b w:val="0"/>
           <w:sz w:val="24"/>
         </w:rPr>
-        <w:t>Eu sou psicóloga desde 2018, com mais de três mil horas de atendimento, e criei a Jornada AME-SE baseada em terapia do esquema e terapia cognitivo-comportamental, pra te ajudar a entender essa raiz e conseguir se abrir de verdade.</w:t>
+        <w:t>Muito prazer, me chamo Camila Sartori, psicóloga desde 2018, com mais de três mil horas de atendimento. Com base em toda experiência que adquiri nesses quase 10 anos de profissão, desenvolvi um passo a passo baseado em terapia do esquema e terapia cognitivo-comportamental, para te ajudar a entender essa raiz e conseguir se abrir de verdade.</w:t>
       </w:r>
     </w:p>
     <w:p>
@@ -317,7 +349,31 @@
           <w:b w:val="0"/>
           <w:sz w:val="24"/>
         </w:rPr>
-        <w:t>Pra conhecer mais sobre o curso, clique no botão que vai aparecer na sua tela."</w:t>
+        <w:t>Para saber mais, toque no botão que vai aparecer na sua tela."</w:t>
+      </w:r>
+    </w:p>
+    <w:p>
+      <w:r>
+        <w:rPr>
+          <w:b/>
+          <w:sz w:val="22"/>
+        </w:rPr>
+        <w:t>Legenda:</w:t>
+      </w:r>
+      <w:r>
+        <w:rPr>
+          <w:b w:val="0"/>
+          <w:sz w:val="22"/>
+        </w:rPr>
+        <w:t xml:space="preserve"> Se afastar antes de ser machucada também é uma forma de sofrer sozinha. Toque no botão para saber mais.</w:t>
+      </w:r>
+    </w:p>
+    <w:p>
+      <w:r>
+        <w:rPr>
+          <w:color w:val="CCCCCC"/>
+        </w:rPr>
+        <w:t>____________________________________________________________</w:t>
       </w:r>
     </w:p>
     <w:p>
@@ -330,7 +386,7 @@
           <w:color w:val="6E0E3D"/>
           <w:sz w:val="30"/>
         </w:rPr>
-        <w:t>Anúncio 3 — Autocrítica e sensação de insuficiência</w:t>
+        <w:t>Anúncio 3: Autocrítica e sensação de insuficiência</w:t>
       </w:r>
     </w:p>
     <w:p>
@@ -339,14 +395,23 @@
           <w:b/>
           <w:sz w:val="22"/>
         </w:rPr>
-        <w:t>Dor:</w:t>
+        <w:t>Cenário sugerido:</w:t>
       </w:r>
       <w:r>
         <w:rPr>
           <w:b w:val="0"/>
           <w:sz w:val="22"/>
         </w:rPr>
-        <w:t xml:space="preserve"> se cobrar demais, nunca sentir que é o bastante, mesmo fazendo tudo certo.</w:t>
+        <w:t xml:space="preserve"> em pé, encostada em uma estante de livros ou perto da janela, com boa luz natural.</w:t>
+      </w:r>
+    </w:p>
+    <w:p>
+      <w:r>
+        <w:rPr>
+          <w:b/>
+          <w:sz w:val="22"/>
+        </w:rPr>
+        <w:t>Roteiro:</w:t>
       </w:r>
     </w:p>
     <w:p>
@@ -358,7 +423,7 @@
           <w:b w:val="0"/>
           <w:sz w:val="24"/>
         </w:rPr>
-        <w:t>"Você já fez tudo certo e mesmo assim sentiu que não foi suficiente? Já se cobrou tanto que no fim do dia só sobrou cansaço e a sensação de estar sempre devendo alguma coisa pra alguém, ou pra você mesma?</w:t>
+        <w:t>"Você já fez tudo certo e mesmo assim sentiu que não foi suficiente? Já se cobrou tanto que no fim do dia só sobrou cansaço e a sensação de estar sempre devendo alguma coisa para alguém, ou para você mesma?</w:t>
       </w:r>
     </w:p>
     <w:p>
@@ -379,7 +444,7 @@
           <w:b w:val="0"/>
           <w:sz w:val="24"/>
         </w:rPr>
-        <w:t>Essa voz que te diz que você não é boa o bastante não é a verdade, é uma crença limitante, formada muito antes de você conseguir escolher outra coisa. E ela pode ser desconstruída. Imagina terminar o dia sem esse peso. Se olhar no espelho e sentir orgulho, não cobrança.</w:t>
+        <w:t>Essa voz que te diz que você não é boa o bastante não é verdade. É uma crença limitante, e ela pode ser desconstruída.</w:t>
       </w:r>
     </w:p>
     <w:p>
@@ -400,7 +465,7 @@
           <w:b w:val="0"/>
           <w:sz w:val="24"/>
         </w:rPr>
-        <w:t>Eu sou psicóloga desde 2018, com mais de três mil horas de atendimento, e criei a Jornada AME-SE, baseada em terapia do esquema e terapia cognitivo-comportamental, pra te ajudar a identificar e transformar essa autocrítica em autoconfiança de verdade.</w:t>
+        <w:t>Imagine terminar o dia sem esse peso, se olhar no espelho e sentir orgulho, e não cobrança.</w:t>
       </w:r>
     </w:p>
     <w:p>
@@ -421,48 +486,7 @@
           <w:b w:val="0"/>
           <w:sz w:val="24"/>
         </w:rPr>
-        <w:t>Pra conhecer mais sobre o curso, clique no botão que vai aparecer na sua tela."</w:t>
-      </w:r>
-    </w:p>
-    <w:p>
-      <w:pPr>
-        <w:pStyle w:val="Heading1"/>
-      </w:pPr>
-      <w:r>
-        <w:rPr>
-          <w:b w:val="0"/>
-          <w:color w:val="6E0E3D"/>
-          <w:sz w:val="30"/>
-        </w:rPr>
-        <w:t>Anúncio 4 — Anulação de si mesma / dificuldade de dizer não</w:t>
-      </w:r>
-    </w:p>
-    <w:p>
-      <w:r>
-        <w:rPr>
-          <w:b/>
-          <w:sz w:val="22"/>
-        </w:rPr>
-        <w:t>Dor:</w:t>
-      </w:r>
-      <w:r>
-        <w:rPr>
-          <w:b w:val="0"/>
-          <w:sz w:val="22"/>
-        </w:rPr>
-        <w:t xml:space="preserve"> colocar todo mundo na frente, dizer sim quando queria dizer não, se perder de vista.</w:t>
-      </w:r>
-    </w:p>
-    <w:p>
-      <w:pPr>
-        <w:pStyle w:val="IntenseQuote"/>
-      </w:pPr>
-      <w:r>
-        <w:rPr>
-          <w:b w:val="0"/>
-          <w:sz w:val="24"/>
-        </w:rPr>
-        <w:t>"Quantas vezes você disse sim quando queria dizer não, só pra não desapontar alguém? Quantas vezes você colocou todo mundo na frente e esqueceu de perguntar o que você realmente queria?</w:t>
+        <w:t>Muito prazer, me chamo Camila Sartori, psicóloga desde 2018, com mais de três mil horas de atendimento. Com base em toda a experiência que adquiri nesses quase dez anos de profissão, desenvolvi um curso, baseado também na terapia do esquema e terapia cognitivo-comportamental, para te ajudar a identificar e transformar a autocrítica em autoconfiança de verdade.</w:t>
       </w:r>
     </w:p>
     <w:p>
@@ -483,7 +507,81 @@
           <w:b w:val="0"/>
           <w:sz w:val="24"/>
         </w:rPr>
-        <w:t>Se anular não é ser gentil, é um padrão que você aprendeu, e que tá te afastando de uma vida que realmente é sua. Imagina conseguir dizer não sem culpa. Colocar seus limites e continuar sendo amada mesmo assim. Isso é possível, e começa com autoconhecimento.</w:t>
+        <w:t>Para saber mais, toque no botão que vai aparecer na sua tela."</w:t>
+      </w:r>
+    </w:p>
+    <w:p>
+      <w:r>
+        <w:rPr>
+          <w:b/>
+          <w:sz w:val="22"/>
+        </w:rPr>
+        <w:t>Legenda:</w:t>
+      </w:r>
+      <w:r>
+        <w:rPr>
+          <w:b w:val="0"/>
+          <w:sz w:val="22"/>
+        </w:rPr>
+        <w:t xml:space="preserve"> Você não precisa se cobrar tanto para merecer se sentir bem. Toque no botão e conheça o curso.</w:t>
+      </w:r>
+    </w:p>
+    <w:p>
+      <w:r>
+        <w:rPr>
+          <w:color w:val="CCCCCC"/>
+        </w:rPr>
+        <w:t>____________________________________________________________</w:t>
+      </w:r>
+    </w:p>
+    <w:p>
+      <w:pPr>
+        <w:pStyle w:val="Heading1"/>
+      </w:pPr>
+      <w:r>
+        <w:rPr>
+          <w:b w:val="0"/>
+          <w:color w:val="6E0E3D"/>
+          <w:sz w:val="30"/>
+        </w:rPr>
+        <w:t>Anúncio 4: Anulação de si mesma, dificuldade de dizer não</w:t>
+      </w:r>
+    </w:p>
+    <w:p>
+      <w:r>
+        <w:rPr>
+          <w:b/>
+          <w:sz w:val="22"/>
+        </w:rPr>
+        <w:t>Cenário sugerido:</w:t>
+      </w:r>
+      <w:r>
+        <w:rPr>
+          <w:b w:val="0"/>
+          <w:sz w:val="22"/>
+        </w:rPr>
+        <w:t xml:space="preserve"> sentada à mesa do consultório, talvez com uma caneta ou caderno nas mãos enquanto fala.</w:t>
+      </w:r>
+    </w:p>
+    <w:p>
+      <w:r>
+        <w:rPr>
+          <w:b/>
+          <w:sz w:val="22"/>
+        </w:rPr>
+        <w:t>Roteiro:</w:t>
+      </w:r>
+    </w:p>
+    <w:p>
+      <w:pPr>
+        <w:pStyle w:val="IntenseQuote"/>
+      </w:pPr>
+      <w:r>
+        <w:rPr>
+          <w:b w:val="0"/>
+          <w:sz w:val="24"/>
+        </w:rPr>
+        <w:t>"Mulher, toda vez que você diz sim para todo mundo, é mais um não que está dizendo para si mesma.</w:t>
       </w:r>
     </w:p>
     <w:p>
@@ -504,7 +602,7 @@
           <w:b w:val="0"/>
           <w:sz w:val="24"/>
         </w:rPr>
-        <w:t>Eu sou psicóloga desde 2018, com mais de três mil horas de atendimento, e criei a Jornada AME-SE, baseada em terapia do esquema e terapia cognitivo-comportamental, pra te ajudar a construir limites saudáveis sem culpa.</w:t>
+        <w:t>Quantas vezes você disse sim quando queria dizer não, só para não desapontar alguém? Quantas vezes você colocou todo mundo na frente e esqueceu de se perguntar o que você realmente queria naquele momento?</w:t>
       </w:r>
     </w:p>
     <w:p>
@@ -525,48 +623,7 @@
           <w:b w:val="0"/>
           <w:sz w:val="24"/>
         </w:rPr>
-        <w:t>Pra conhecer mais sobre o curso, clique no botão que vai aparecer na sua tela."</w:t>
-      </w:r>
-    </w:p>
-    <w:p>
-      <w:pPr>
-        <w:pStyle w:val="Heading1"/>
-      </w:pPr>
-      <w:r>
-        <w:rPr>
-          <w:b w:val="0"/>
-          <w:color w:val="6E0E3D"/>
-          <w:sz w:val="30"/>
-        </w:rPr>
-        <w:t>Anúncio 5 — Padrões repetidos / origem na infância</w:t>
-      </w:r>
-    </w:p>
-    <w:p>
-      <w:r>
-        <w:rPr>
-          <w:b/>
-          <w:sz w:val="22"/>
-        </w:rPr>
-        <w:t>Dor:</w:t>
-      </w:r>
-      <w:r>
-        <w:rPr>
-          <w:b w:val="0"/>
-          <w:sz w:val="22"/>
-        </w:rPr>
-        <w:t xml:space="preserve"> repetir o mesmo erro em relacionamentos diferentes, sem entender por quê. (Ângulo de mais autoridade.)</w:t>
-      </w:r>
-    </w:p>
-    <w:p>
-      <w:pPr>
-        <w:pStyle w:val="IntenseQuote"/>
-      </w:pPr>
-      <w:r>
-        <w:rPr>
-          <w:b w:val="0"/>
-          <w:sz w:val="24"/>
-        </w:rPr>
-        <w:t>"Você percebe que sempre repete o mesmo tipo de erro nos relacionamentos, mesmo trocando de parceiro, de emprego, de cidade? Isso não é falta de sorte. Padrões se repetem porque eles nascem de crenças formadas na infância, muitas vezes antes mesmo de você conseguir colocar em palavras o que estava sentindo. E enquanto você não entende essa origem, o padrão continua se repetindo.</w:t>
+        <w:t>Se anular não é ser gentil, é um padrão que você aprendeu, e que está te afastando de uma vida que realmente é sua.</w:t>
       </w:r>
     </w:p>
     <w:p>
@@ -587,7 +644,7 @@
           <w:b w:val="0"/>
           <w:sz w:val="24"/>
         </w:rPr>
-        <w:t>Eu sou psicóloga formada desde 2018, com mais de três mil horas de atendimento clínico, e trabalho com terapia do esquema exatamente pra isso: encontrar a raiz e mudar o padrão de verdade, não só o sintoma. Criei a Jornada AME-SE com tudo que aplico na prática clínica, unindo terapia do esquema e terapia cognitivo-comportamental.</w:t>
+        <w:t>Agora, imagine conseguir dizer não sem culpa, colocando seus limites, e continuar sendo amada mesmo assim. Isso é possível e começa com autoconhecimento.</w:t>
       </w:r>
     </w:p>
     <w:p>
@@ -608,7 +665,44 @@
           <w:b w:val="0"/>
           <w:sz w:val="24"/>
         </w:rPr>
-        <w:t>Pra conhecer mais sobre o curso, clique no botão que vai aparecer na sua tela."</w:t>
+        <w:t>Muito prazer, me chamo Camila Sartori, psicóloga desde 2018, com mais de três mil horas de atendimento. Com base em toda a minha experiência, e também na terapia do esquema e terapia cognitivo-comportamental, eu desenvolvi um curso para ajudar pessoas como você a construir limites saudáveis sem culpa, e assim ter mais qualidade de vida.</w:t>
+      </w:r>
+    </w:p>
+    <w:p>
+      <w:r>
+        <w:rPr>
+          <w:b w:val="0"/>
+          <w:sz w:val="22"/>
+        </w:rPr>
+        <w:t>&gt;</w:t>
+      </w:r>
+    </w:p>
+    <w:p>
+      <w:pPr>
+        <w:pStyle w:val="IntenseQuote"/>
+      </w:pPr>
+      <w:r>
+        <w:rPr>
+          <w:b w:val="0"/>
+          <w:sz w:val="24"/>
+        </w:rPr>
+        <w:t>Para saber mais, toque no botão que vai aparecer na sua tela."</w:t>
+      </w:r>
+    </w:p>
+    <w:p>
+      <w:r>
+        <w:rPr>
+          <w:b/>
+          <w:sz w:val="22"/>
+        </w:rPr>
+        <w:t>Legenda:</w:t>
+      </w:r>
+      <w:r>
+        <w:rPr>
+          <w:b w:val="0"/>
+          <w:sz w:val="22"/>
+        </w:rPr>
+        <w:t xml:space="preserve"> Dizer sim para todo mundo pode ser dizer não para você mesma. Toque no botão e conheça o curso.</w:t>
       </w:r>
     </w:p>
     <w:p>
@@ -629,7 +723,687 @@
           <w:color w:val="6E0E3D"/>
           <w:sz w:val="30"/>
         </w:rPr>
-        <w:t>Calendário de rotação (verba R$15/dia, só Instagram)</w:t>
+        <w:t>Anúncio 5: Padrões repetidos</w:t>
+      </w:r>
+    </w:p>
+    <w:p>
+      <w:r>
+        <w:rPr>
+          <w:b/>
+          <w:sz w:val="22"/>
+        </w:rPr>
+        <w:t>Cenário sugerido:</w:t>
+      </w:r>
+      <w:r>
+        <w:rPr>
+          <w:b w:val="0"/>
+          <w:sz w:val="22"/>
+        </w:rPr>
+        <w:t xml:space="preserve"> em pé, caminhando lentamente em direção à câmera, como se estivesse chegando a uma virada.</w:t>
+      </w:r>
+    </w:p>
+    <w:p>
+      <w:r>
+        <w:rPr>
+          <w:b/>
+          <w:sz w:val="22"/>
+        </w:rPr>
+        <w:t>Roteiro:</w:t>
+      </w:r>
+    </w:p>
+    <w:p>
+      <w:pPr>
+        <w:pStyle w:val="IntenseQuote"/>
+      </w:pPr>
+      <w:r>
+        <w:rPr>
+          <w:b w:val="0"/>
+          <w:sz w:val="24"/>
+        </w:rPr>
+        <w:t>"Você muda de trabalho, muda de cidade, muda de relacionamento, e mesmo assim os mesmos padrões continuam te perseguindo? Parece que, mesmo mudando o cenário e as pessoas ao redor, a mesma situação se repete, de novo, e de novo?</w:t>
+      </w:r>
+    </w:p>
+    <w:p>
+      <w:r>
+        <w:rPr>
+          <w:b w:val="0"/>
+          <w:sz w:val="22"/>
+        </w:rPr>
+        <w:t>&gt;</w:t>
+      </w:r>
+    </w:p>
+    <w:p>
+      <w:pPr>
+        <w:pStyle w:val="IntenseQuote"/>
+      </w:pPr>
+      <w:r>
+        <w:rPr>
+          <w:b w:val="0"/>
+          <w:sz w:val="24"/>
+        </w:rPr>
+        <w:t>Isso não é falta de sorte. Esse tipo de repetição nasce de crenças muitas vezes formadas na infância. E enquanto você não entende essa origem, o ciclo continua se repetindo.</w:t>
+      </w:r>
+    </w:p>
+    <w:p>
+      <w:r>
+        <w:rPr>
+          <w:b w:val="0"/>
+          <w:sz w:val="22"/>
+        </w:rPr>
+        <w:t>&gt;</w:t>
+      </w:r>
+    </w:p>
+    <w:p>
+      <w:pPr>
+        <w:pStyle w:val="IntenseQuote"/>
+      </w:pPr>
+      <w:r>
+        <w:rPr>
+          <w:b w:val="0"/>
+          <w:sz w:val="24"/>
+        </w:rPr>
+        <w:t>Muito prazer, me chamo Camila Sartori, psicóloga formada desde 2018, com mais de três mil horas de atendimento clínico. Trabalho com a terapia do esquema e terapia cognitivo-comportamental, e com base em toda a minha experiência e estudos, desenvolvi um curso para ajudar mulheres como você a encontrarem a raiz dessas crenças e comportamentos repetidos, e assim conseguirem viver relações mais saudáveis e ter mais qualidade de vida.</w:t>
+      </w:r>
+    </w:p>
+    <w:p>
+      <w:r>
+        <w:rPr>
+          <w:b w:val="0"/>
+          <w:sz w:val="22"/>
+        </w:rPr>
+        <w:t>&gt;</w:t>
+      </w:r>
+    </w:p>
+    <w:p>
+      <w:pPr>
+        <w:pStyle w:val="IntenseQuote"/>
+      </w:pPr>
+      <w:r>
+        <w:rPr>
+          <w:b w:val="0"/>
+          <w:sz w:val="24"/>
+        </w:rPr>
+        <w:t>Se você quiser saber mais, toque no botão que vai aparecer na sua tela."</w:t>
+      </w:r>
+    </w:p>
+    <w:p>
+      <w:r>
+        <w:rPr>
+          <w:b/>
+          <w:sz w:val="22"/>
+        </w:rPr>
+        <w:t>Legenda:</w:t>
+      </w:r>
+      <w:r>
+        <w:rPr>
+          <w:b w:val="0"/>
+          <w:sz w:val="22"/>
+        </w:rPr>
+        <w:t xml:space="preserve"> Se os cenários mudam mas o problema se repete, o padrão está em você, não no acaso. Toque no botão e conheça o curso.</w:t>
+      </w:r>
+    </w:p>
+    <w:p>
+      <w:r>
+        <w:rPr>
+          <w:color w:val="CCCCCC"/>
+        </w:rPr>
+        <w:t>____________________________________________________________</w:t>
+      </w:r>
+    </w:p>
+    <w:p>
+      <w:pPr>
+        <w:pStyle w:val="Heading1"/>
+      </w:pPr>
+      <w:r>
+        <w:rPr>
+          <w:b w:val="0"/>
+          <w:color w:val="6E0E3D"/>
+          <w:sz w:val="30"/>
+        </w:rPr>
+        <w:t>Vídeos para o Feed (topo, meio e fundo de funil)</w:t>
+      </w:r>
+    </w:p>
+    <w:p>
+      <w:r>
+        <w:rPr>
+          <w:b w:val="0"/>
+          <w:sz w:val="22"/>
+        </w:rPr>
+        <w:t>Objetivo: parar o scroll, gerar identificação progressiva enquanto a pessoa assiste, e terminar com um comentário de palavra-chave que ativa a automação Youze, levando a conversa para o direct.</w:t>
+      </w:r>
+    </w:p>
+    <w:p>
+      <w:pPr>
+        <w:pStyle w:val="Heading2"/>
+      </w:pPr>
+      <w:r>
+        <w:rPr>
+          <w:b w:val="0"/>
+          <w:color w:val="6E0E3D"/>
+          <w:sz w:val="26"/>
+        </w:rPr>
+        <w:t>Feed A: Topo de funil (autoestima/insegurança, gancho amplo)</w:t>
+      </w:r>
+    </w:p>
+    <w:p>
+      <w:r>
+        <w:rPr>
+          <w:b/>
+          <w:sz w:val="22"/>
+        </w:rPr>
+        <w:t>Cenário sugerido:</w:t>
+      </w:r>
+      <w:r>
+        <w:rPr>
+          <w:b w:val="0"/>
+          <w:sz w:val="22"/>
+        </w:rPr>
+        <w:t xml:space="preserve"> sentada em um sofá ou poltrona confortável do consultório, postura leve e acolhedora.</w:t>
+      </w:r>
+    </w:p>
+    <w:p>
+      <w:r>
+        <w:rPr>
+          <w:b/>
+          <w:sz w:val="22"/>
+        </w:rPr>
+        <w:t>Roteiro:</w:t>
+      </w:r>
+    </w:p>
+    <w:p>
+      <w:pPr>
+        <w:pStyle w:val="IntenseQuote"/>
+      </w:pPr>
+      <w:r>
+        <w:rPr>
+          <w:b w:val="0"/>
+          <w:sz w:val="24"/>
+        </w:rPr>
+        <w:t>"Se você se pega se comparando com todo mundo, achando que todo mundo está bem menos você, esse vídeo é para você.</w:t>
+      </w:r>
+    </w:p>
+    <w:p>
+      <w:r>
+        <w:rPr>
+          <w:b w:val="0"/>
+          <w:sz w:val="22"/>
+        </w:rPr>
+        <w:t>&gt;</w:t>
+      </w:r>
+    </w:p>
+    <w:p>
+      <w:pPr>
+        <w:pStyle w:val="IntenseQuote"/>
+      </w:pPr>
+      <w:r>
+        <w:rPr>
+          <w:b w:val="0"/>
+          <w:sz w:val="24"/>
+        </w:rPr>
+        <w:t>A gente acha que insegurança é só não gostar do corpo ou não saber se vestir, mas na verdade ela aparece em coisas muito mais silenciosas: no jeito que você aceita qualquer tratamento numa relação, no jeito que você nunca acha que está pronta o suficiente para pedir um aumento, no jeito que você sempre coloca a opinião dos outros na frente da sua.</w:t>
+      </w:r>
+    </w:p>
+    <w:p>
+      <w:r>
+        <w:rPr>
+          <w:b w:val="0"/>
+          <w:sz w:val="22"/>
+        </w:rPr>
+        <w:t>&gt;</w:t>
+      </w:r>
+    </w:p>
+    <w:p>
+      <w:pPr>
+        <w:pStyle w:val="IntenseQuote"/>
+      </w:pPr>
+      <w:r>
+        <w:rPr>
+          <w:b w:val="0"/>
+          <w:sz w:val="24"/>
+        </w:rPr>
+        <w:t>Se isso faz sentido para você, saiba que não é frescura, e não é definitivo. Existe um caminho para entender de onde isso vem e mudar essa história.</w:t>
+      </w:r>
+    </w:p>
+    <w:p>
+      <w:r>
+        <w:rPr>
+          <w:b w:val="0"/>
+          <w:sz w:val="22"/>
+        </w:rPr>
+        <w:t>&gt;</w:t>
+      </w:r>
+    </w:p>
+    <w:p>
+      <w:pPr>
+        <w:pStyle w:val="IntenseQuote"/>
+      </w:pPr>
+      <w:r>
+        <w:rPr>
+          <w:b w:val="0"/>
+          <w:sz w:val="24"/>
+        </w:rPr>
+        <w:t>Eu sou Camila Sartori, psicóloga, e trabalho todos os dias ajudando mulheres a construir mais confiança e autoestima de verdade.</w:t>
+      </w:r>
+    </w:p>
+    <w:p>
+      <w:r>
+        <w:rPr>
+          <w:b w:val="0"/>
+          <w:sz w:val="22"/>
+        </w:rPr>
+        <w:t>&gt;</w:t>
+      </w:r>
+    </w:p>
+    <w:p>
+      <w:pPr>
+        <w:pStyle w:val="IntenseQuote"/>
+      </w:pPr>
+      <w:r>
+        <w:rPr>
+          <w:b w:val="0"/>
+          <w:sz w:val="24"/>
+        </w:rPr>
+        <w:t>Comente: 'CONFIANÇA' e olha o que eu vou te enviar no seu direct."</w:t>
+      </w:r>
+    </w:p>
+    <w:p>
+      <w:r>
+        <w:rPr>
+          <w:b/>
+          <w:sz w:val="22"/>
+        </w:rPr>
+        <w:t>Legenda:</w:t>
+      </w:r>
+      <w:r>
+        <w:rPr>
+          <w:b w:val="0"/>
+          <w:sz w:val="22"/>
+        </w:rPr>
+        <w:t xml:space="preserve"> Insegurança aparece de formas que você nem percebe. Comente CONFIANÇA e vem comigo entender mais.</w:t>
+      </w:r>
+    </w:p>
+    <w:p>
+      <w:pPr>
+        <w:pStyle w:val="Heading2"/>
+      </w:pPr>
+      <w:r>
+        <w:rPr>
+          <w:b w:val="0"/>
+          <w:color w:val="6E0E3D"/>
+          <w:sz w:val="26"/>
+        </w:rPr>
+        <w:t>Feed B: Meio de funil (ciúme/apego)</w:t>
+      </w:r>
+    </w:p>
+    <w:p>
+      <w:r>
+        <w:rPr>
+          <w:b/>
+          <w:sz w:val="22"/>
+        </w:rPr>
+        <w:t>Cenário sugerido:</w:t>
+      </w:r>
+      <w:r>
+        <w:rPr>
+          <w:b w:val="0"/>
+          <w:sz w:val="22"/>
+        </w:rPr>
+        <w:t xml:space="preserve"> em pé, perto de uma janela ou planta, tom mais próximo e confidencial.</w:t>
+      </w:r>
+    </w:p>
+    <w:p>
+      <w:r>
+        <w:rPr>
+          <w:b/>
+          <w:sz w:val="22"/>
+        </w:rPr>
+        <w:t>Roteiro:</w:t>
+      </w:r>
+    </w:p>
+    <w:p>
+      <w:pPr>
+        <w:pStyle w:val="IntenseQuote"/>
+      </w:pPr>
+      <w:r>
+        <w:rPr>
+          <w:b w:val="0"/>
+          <w:sz w:val="24"/>
+        </w:rPr>
+        <w:t>"Você já ficou horas analisando as mensagens ou story de alguém, tentando entender uma coisa que talvez só existisse na sua cabeça?</w:t>
+      </w:r>
+    </w:p>
+    <w:p>
+      <w:r>
+        <w:rPr>
+          <w:b w:val="0"/>
+          <w:sz w:val="22"/>
+        </w:rPr>
+        <w:t>&gt;</w:t>
+      </w:r>
+    </w:p>
+    <w:p>
+      <w:pPr>
+        <w:pStyle w:val="IntenseQuote"/>
+      </w:pPr>
+      <w:r>
+        <w:rPr>
+          <w:b w:val="0"/>
+          <w:sz w:val="24"/>
+        </w:rPr>
+        <w:t>Ciúme demais não é sinônimo de amor, e sim de insegurança. E o problema é que, sem entender de onde vem esse padrão, ele se repete com pessoas diferentes e relações diferentes.</w:t>
+      </w:r>
+    </w:p>
+    <w:p>
+      <w:r>
+        <w:rPr>
+          <w:b w:val="0"/>
+          <w:sz w:val="22"/>
+        </w:rPr>
+        <w:t>&gt;</w:t>
+      </w:r>
+    </w:p>
+    <w:p>
+      <w:pPr>
+        <w:pStyle w:val="IntenseQuote"/>
+      </w:pPr>
+      <w:r>
+        <w:rPr>
+          <w:b w:val="0"/>
+          <w:sz w:val="24"/>
+        </w:rPr>
+        <w:t>A boa notícia é que dá para entender a raiz disso, e parar de reviver a mesma dor, quebrando esses padrões.</w:t>
+      </w:r>
+    </w:p>
+    <w:p>
+      <w:r>
+        <w:rPr>
+          <w:b w:val="0"/>
+          <w:sz w:val="22"/>
+        </w:rPr>
+        <w:t>&gt;</w:t>
+      </w:r>
+    </w:p>
+    <w:p>
+      <w:pPr>
+        <w:pStyle w:val="IntenseQuote"/>
+      </w:pPr>
+      <w:r>
+        <w:rPr>
+          <w:b w:val="0"/>
+          <w:sz w:val="24"/>
+        </w:rPr>
+        <w:t>Eu sou Camila Sartori, psicóloga, e trabalho com terapia do esquema e TCC, exatamente para ajudar mulheres a entenderem e quebrar esses padrões.</w:t>
+      </w:r>
+    </w:p>
+    <w:p>
+      <w:r>
+        <w:rPr>
+          <w:b w:val="0"/>
+          <w:sz w:val="22"/>
+        </w:rPr>
+        <w:t>&gt;</w:t>
+      </w:r>
+    </w:p>
+    <w:p>
+      <w:pPr>
+        <w:pStyle w:val="IntenseQuote"/>
+      </w:pPr>
+      <w:r>
+        <w:rPr>
+          <w:b w:val="0"/>
+          <w:sz w:val="24"/>
+        </w:rPr>
+        <w:t>Comente 'CIÚME' e olha o que eu vou te enviar no seu direct, garanto que você vai adorar."</w:t>
+      </w:r>
+    </w:p>
+    <w:p>
+      <w:r>
+        <w:rPr>
+          <w:b/>
+          <w:sz w:val="22"/>
+        </w:rPr>
+        <w:t>Legenda:</w:t>
+      </w:r>
+      <w:r>
+        <w:rPr>
+          <w:b w:val="0"/>
+          <w:sz w:val="22"/>
+        </w:rPr>
+        <w:t xml:space="preserve"> Ciúme em excesso fala mais sobre insegurança do que sobre amor. Comente CIÚME e olha o que vou te mandar.</w:t>
+      </w:r>
+    </w:p>
+    <w:p>
+      <w:pPr>
+        <w:pStyle w:val="Heading2"/>
+      </w:pPr>
+      <w:r>
+        <w:rPr>
+          <w:b w:val="0"/>
+          <w:color w:val="6E0E3D"/>
+          <w:sz w:val="26"/>
+        </w:rPr>
+        <w:t>Feed C: Fundo de funil (relacionamentos, "ficante virou namorado")</w:t>
+      </w:r>
+    </w:p>
+    <w:p>
+      <w:r>
+        <w:rPr>
+          <w:b/>
+          <w:sz w:val="22"/>
+        </w:rPr>
+        <w:t>Cenário sugerido:</w:t>
+      </w:r>
+      <w:r>
+        <w:rPr>
+          <w:b w:val="0"/>
+          <w:sz w:val="22"/>
+        </w:rPr>
+        <w:t xml:space="preserve"> caminhando pelo corredor ou em pé em um ambiente mais aberto da clínica, energia mais viva.</w:t>
+      </w:r>
+    </w:p>
+    <w:p>
+      <w:r>
+        <w:rPr>
+          <w:b/>
+          <w:sz w:val="22"/>
+        </w:rPr>
+        <w:t>Roteiro:</w:t>
+      </w:r>
+    </w:p>
+    <w:p>
+      <w:pPr>
+        <w:pStyle w:val="IntenseQuote"/>
+      </w:pPr>
+      <w:r>
+        <w:rPr>
+          <w:b w:val="0"/>
+          <w:sz w:val="24"/>
+        </w:rPr>
+        <w:t>"Toda mulher quer um relacionamento que funcione, com um parceiro presente, funcional, que a valorize de verdade, não é mesmo?</w:t>
+      </w:r>
+    </w:p>
+    <w:p>
+      <w:r>
+        <w:rPr>
+          <w:b w:val="0"/>
+          <w:sz w:val="22"/>
+        </w:rPr>
+        <w:t>&gt;</w:t>
+      </w:r>
+    </w:p>
+    <w:p>
+      <w:pPr>
+        <w:pStyle w:val="IntenseQuote"/>
+      </w:pPr>
+      <w:r>
+        <w:rPr>
+          <w:b w:val="0"/>
+          <w:sz w:val="24"/>
+        </w:rPr>
+        <w:t>Porém, muitas dessas mulheres já tratam ficante logo de cara como namorado, ou começam a cobrar por insegurança antes mesmo de que algo se torne um relacionamento de verdade. E quando vai perceber, está sozinha de novo.</w:t>
+      </w:r>
+    </w:p>
+    <w:p>
+      <w:r>
+        <w:rPr>
+          <w:b w:val="0"/>
+          <w:sz w:val="22"/>
+        </w:rPr>
+        <w:t>&gt;</w:t>
+      </w:r>
+    </w:p>
+    <w:p>
+      <w:pPr>
+        <w:pStyle w:val="IntenseQuote"/>
+      </w:pPr>
+      <w:r>
+        <w:rPr>
+          <w:b w:val="0"/>
+          <w:sz w:val="24"/>
+        </w:rPr>
+        <w:t>E aí vêm alguns pensamentos: que nenhum homem no mundo presta, que quem casou, casou, que o jeito é ficar sozinha mesmo, ou até o tal do celibato forçado.</w:t>
+      </w:r>
+    </w:p>
+    <w:p>
+      <w:r>
+        <w:rPr>
+          <w:b w:val="0"/>
+          <w:sz w:val="22"/>
+        </w:rPr>
+        <w:t>&gt;</w:t>
+      </w:r>
+    </w:p>
+    <w:p>
+      <w:pPr>
+        <w:pStyle w:val="IntenseQuote"/>
+      </w:pPr>
+      <w:r>
+        <w:rPr>
+          <w:b w:val="0"/>
+          <w:sz w:val="24"/>
+        </w:rPr>
+        <w:t>Mas o que muitas mulheres não refletem é que, na maioria das vezes, tem um padrão por trás que está regendo a forma como ela está lidando com isso. Seja a dificuldade de se posicionar, o medo de deixar claro que gostaria de um compromisso, ou até mesmo as escolhas de sempre acabar se relacionando com pessoas emocionalmente indisponíveis.</w:t>
+      </w:r>
+    </w:p>
+    <w:p>
+      <w:r>
+        <w:rPr>
+          <w:b w:val="0"/>
+          <w:sz w:val="22"/>
+        </w:rPr>
+        <w:t>&gt;</w:t>
+      </w:r>
+    </w:p>
+    <w:p>
+      <w:pPr>
+        <w:pStyle w:val="IntenseQuote"/>
+      </w:pPr>
+      <w:r>
+        <w:rPr>
+          <w:b w:val="0"/>
+          <w:sz w:val="24"/>
+        </w:rPr>
+        <w:t>Quando você entende qual é esse padrão por trás, que te faz se manter no mesmo erro nos seus relacionamentos, repetindo sempre o mesmo cenário, você percebe que provavelmente é algo que você absorveu inconscientemente em algum momento da sua vida, como na infância, por exemplo.</w:t>
+      </w:r>
+    </w:p>
+    <w:p>
+      <w:r>
+        <w:rPr>
+          <w:b w:val="0"/>
+          <w:sz w:val="22"/>
+        </w:rPr>
+        <w:t>&gt;</w:t>
+      </w:r>
+    </w:p>
+    <w:p>
+      <w:pPr>
+        <w:pStyle w:val="IntenseQuote"/>
+      </w:pPr>
+      <w:r>
+        <w:rPr>
+          <w:b w:val="0"/>
+          <w:sz w:val="24"/>
+        </w:rPr>
+        <w:t>Mas é possível mudar esse padrão, e aprender a escolher pessoas emocionalmente disponíveis. E sim, gente, ainda existe homem para relacionamento sério nesse mundo.</w:t>
+      </w:r>
+    </w:p>
+    <w:p>
+      <w:r>
+        <w:rPr>
+          <w:b w:val="0"/>
+          <w:sz w:val="22"/>
+        </w:rPr>
+        <w:t>&gt;</w:t>
+      </w:r>
+    </w:p>
+    <w:p>
+      <w:pPr>
+        <w:pStyle w:val="IntenseQuote"/>
+      </w:pPr>
+      <w:r>
+        <w:rPr>
+          <w:b w:val="0"/>
+          <w:sz w:val="24"/>
+        </w:rPr>
+        <w:t>Eu sou Camila Sartori, psicóloga, e ajudo mulheres a entenderem esses padrões para terem relacionamentos mais saudáveis e duradouros.</w:t>
+      </w:r>
+    </w:p>
+    <w:p>
+      <w:r>
+        <w:rPr>
+          <w:b w:val="0"/>
+          <w:sz w:val="22"/>
+        </w:rPr>
+        <w:t>&gt;</w:t>
+      </w:r>
+    </w:p>
+    <w:p>
+      <w:pPr>
+        <w:pStyle w:val="IntenseQuote"/>
+      </w:pPr>
+      <w:r>
+        <w:rPr>
+          <w:b w:val="0"/>
+          <w:sz w:val="24"/>
+        </w:rPr>
+        <w:t>Se você passa por algum desses padrões e quer, de uma vez por todas, construir relacionamentos que sejam realmente satisfatórios, comente 'RELACIONAMENTO' e olha o que eu vou te enviar no seu direct."</w:t>
+      </w:r>
+    </w:p>
+    <w:p>
+      <w:r>
+        <w:rPr>
+          <w:b/>
+          <w:sz w:val="22"/>
+        </w:rPr>
+        <w:t>Legenda:</w:t>
+      </w:r>
+      <w:r>
+        <w:rPr>
+          <w:b w:val="0"/>
+          <w:sz w:val="22"/>
+        </w:rPr>
+        <w:t xml:space="preserve"> Nem sempre é falta de sorte, às vezes é um padrão se repetindo. Comente RELACIONAMENTO e olha o que vou te mandar.</w:t>
+      </w:r>
+    </w:p>
+    <w:p>
+      <w:r>
+        <w:rPr>
+          <w:color w:val="CCCCCC"/>
+        </w:rPr>
+        <w:t>____________________________________________________________</w:t>
+      </w:r>
+    </w:p>
+    <w:p>
+      <w:pPr>
+        <w:pStyle w:val="Heading1"/>
+      </w:pPr>
+      <w:r>
+        <w:rPr>
+          <w:b w:val="0"/>
+          <w:color w:val="6E0E3D"/>
+          <w:sz w:val="30"/>
+        </w:rPr>
+        <w:t>Calendário de anúncios (verba R$15/dia, só Instagram)</w:t>
       </w:r>
     </w:p>
     <w:tbl>
@@ -803,7 +1577,7 @@
                 <w:b w:val="0"/>
                 <w:sz w:val="20"/>
               </w:rPr>
-              <w:t>Manter o melhor até aqui + testar Anúncio 4 (anulação/dizer não) ou Anúncio 5 (padrões/origem), o que ainda não foi testado</w:t>
+              <w:t>Manter o melhor até aqui + testar Anúncio 4 (anulação/dizer não) ou Anúncio 5 (padrões repetidos), o que ainda não foi testado</w:t>
             </w:r>
           </w:p>
         </w:tc>
@@ -817,7 +1591,7 @@
                 <w:b w:val="0"/>
                 <w:sz w:val="20"/>
               </w:rPr>
-              <w:t>Nessa altura já deve dar pra visualizar qual dor converte melhor pro público dela, e isso orienta os próximos anúncios quando a verba aumentar.</w:t>
+              <w:t>Nessa altura já deve dar para visualizar qual dor converte melhor para o público dela, e isso orienta os próximos anúncios quando a verba aumentar.</w:t>
             </w:r>
           </w:p>
         </w:tc>
@@ -837,7 +1611,16 @@
           <w:b w:val="0"/>
           <w:sz w:val="22"/>
         </w:rPr>
-        <w:t xml:space="preserve"> nunca rodar mais de 2 anúncios simultâneos com R$15/dia — verba dividida entre muitos criativos não gera dado suficiente pra decidir nada. Assim que a verba subir, dá pra testar 3-4 ao mesmo tempo.</w:t>
+        <w:t xml:space="preserve"> nunca rodar mais de 2 anúncios simultâneos com R$15/dia. Verba dividida entre muitos criativos não gera dado suficiente para decidir nada. Assim que a verba subir, dá para testar 3-4 ao mesmo tempo.</w:t>
+      </w:r>
+    </w:p>
+    <w:p>
+      <w:r>
+        <w:rPr>
+          <w:b w:val="0"/>
+          <w:sz w:val="22"/>
+        </w:rPr>
+        <w:t>Os 3 vídeos de Feed não entram nessa verba paga: são conteúdo orgânico, podem ser publicados ao longo das mesmas semanas, espaçados entre si, para não competir por atenção com os reels do calendário de Instagram.</w:t>
       </w:r>
     </w:p>
     <w:sectPr>

</xml_diff>

<commit_message>
Corrige conclusao do Feed A/B e finaliza legendas dos roteiros de anuncio
Adiciona a frase de conclusao antes do CTA de comentario no Feed A e
Feed B (tinha ficado de fora por engano na rodada anterior), e finaliza
o texto das legendas dos anuncios 3, 4, 5 e dos feeds A e B com a
versao aprovada pela Amanda.

Co-Authored-By: Claude Sonnet 5 <noreply@anthropic.com>
</commit_message>
<xml_diff>
--- a/camila-sartori/exports/roteiros-e-calendario-anuncios.docx
+++ b/camila-sartori/exports/roteiros-e-calendario-anuncios.docx
@@ -523,7 +523,7 @@
           <w:b w:val="0"/>
           <w:sz w:val="22"/>
         </w:rPr>
-        <w:t xml:space="preserve"> Você não precisa se cobrar tanto para merecer se sentir bem. Toque no botão e conheça o curso.</w:t>
+        <w:t xml:space="preserve"> Você não precisa se cobrar tanto para merecer se sentir bem. Se quer transformar essa autocrítica em autoconfiança de verdade, toque no botão para saber mais.</w:t>
       </w:r>
     </w:p>
     <w:p>
@@ -702,7 +702,7 @@
           <w:b w:val="0"/>
           <w:sz w:val="22"/>
         </w:rPr>
-        <w:t xml:space="preserve"> Dizer sim para todo mundo pode ser dizer não para você mesma. Toque no botão e conheça o curso.</w:t>
+        <w:t xml:space="preserve"> Dizer sim para todo mundo pode ser dizer não para você mesma. Se você quer aprender a colocar limites sem culpa, de uma vez por todas, toque no botão para saber mais.</w:t>
       </w:r>
     </w:p>
     <w:p>
@@ -839,7 +839,7 @@
           <w:b w:val="0"/>
           <w:sz w:val="22"/>
         </w:rPr>
-        <w:t xml:space="preserve"> Se os cenários mudam mas o problema se repete, o padrão está em você, não no acaso. Toque no botão e conheça o curso.</w:t>
+        <w:t xml:space="preserve"> Se os cenários mudam mas o problema se repete, o padrão está em você, não no acaso. Se você quer entender essa raiz e parar de repetir a mesma história, toque no botão para saber mais.</w:t>
       </w:r>
     </w:p>
     <w:p>
@@ -1003,7 +1003,7 @@
           <w:b w:val="0"/>
           <w:sz w:val="24"/>
         </w:rPr>
-        <w:t>Comente: 'CONFIANÇA' e olha o que eu vou te enviar no seu direct."</w:t>
+        <w:t>Se você quer parar de se sentir insegura e finalmente confiar em você mesma, comente: 'CONFIANÇA' e olha o que eu vou te enviar no seu direct."</w:t>
       </w:r>
     </w:p>
     <w:p>
@@ -1019,7 +1019,7 @@
           <w:b w:val="0"/>
           <w:sz w:val="22"/>
         </w:rPr>
-        <w:t xml:space="preserve"> Insegurança aparece de formas que você nem percebe. Comente CONFIANÇA e vem comigo entender mais.</w:t>
+        <w:t xml:space="preserve"> Insegurança aparece de formas que você nem percebe, e pode estar te travando sem você notar. Se você quer entender de onde isso vem, quebrar esse padrão e finalmente confiar em você mesma, comente: CONFIANÇA e olha o que eu vou te enviar no seu direct.</w:t>
       </w:r>
     </w:p>
     <w:p>
@@ -1153,7 +1153,7 @@
           <w:b w:val="0"/>
           <w:sz w:val="24"/>
         </w:rPr>
-        <w:t>Comente 'CIÚME' e olha o que eu vou te enviar no seu direct, garanto que você vai adorar."</w:t>
+        <w:t>Se você quer parar de sofrer com ciúme e aprender a ser mais segura de si, comente 'CIÚME' e olha o que eu vou te enviar no seu direct, garanto que você vai adorar."</w:t>
       </w:r>
     </w:p>
     <w:p>
@@ -1169,7 +1169,7 @@
           <w:b w:val="0"/>
           <w:sz w:val="22"/>
         </w:rPr>
-        <w:t xml:space="preserve"> Ciúme em excesso fala mais sobre insegurança do que sobre amor. Comente CIÚME e olha o que vou te mandar.</w:t>
+        <w:t xml:space="preserve"> Ciúme em excesso fala mais sobre insegurança do que sobre amor, e pode estar destruindo seus relacionamentos sem você perceber. Se você quer entender essa raiz, parar de reviver a mesma dor, e se sentir mais segura e confiante, comente: CIÚME e olha o que eu vou te enviar no seu direct.</w:t>
       </w:r>
     </w:p>
     <w:p>

</xml_diff>

<commit_message>
Testa venda direta vs engajamento desde a semana 1 no calendario de anuncios
Reestrutura o calendario de anuncios pra rodar sempre 1 video de venda
direta + 1 de engajamento (comentario com automacao Youze) em paralelo,
desde a primeira semana, cada dupla com o mesmo tema pra isolar a
variavel do funil na comparacao de custo por venda. Define pares fixos
por periodo (Anuncio 1 + Feed B, Anuncio 3 + Feed A, Anuncio 5 + Feed C),
deixando Anuncios 2 e 4 de reserva.

Co-Authored-By: Claude Sonnet 5 <noreply@anthropic.com>
</commit_message>
<xml_diff>
--- a/camila-sartori/exports/roteiros-e-calendario-anuncios.docx
+++ b/camila-sartori/exports/roteiros-e-calendario-anuncios.docx
@@ -1406,6 +1406,15 @@
         <w:t>Calendário de anúncios (verba R$15/dia, só Instagram)</w:t>
       </w:r>
     </w:p>
+    <w:p>
+      <w:r>
+        <w:rPr>
+          <w:b w:val="0"/>
+          <w:sz w:val="22"/>
+        </w:rPr>
+        <w:t>Desde a primeira semana, sempre 1 vídeo de venda direta + 1 vídeo de engajamento rodando ao mesmo tempo, ambos pagos, para comparar o custo por venda dos dois caminhos: vender direto (toque no botão) ou vender via automação de comentário (comenta e recebe DM). Cada dupla usa o mesmo tema dos dois lados, para isolar a variável do funil e não misturar tema com formato na comparação.</w:t>
+      </w:r>
+    </w:p>
     <w:tbl>
       <w:tblPr>
         <w:tblStyle w:val="LightGrid-Accent5"/>
@@ -1413,14 +1422,15 @@
         <w:tblLook w:firstColumn="1" w:firstRow="1" w:lastColumn="0" w:lastRow="0" w:noHBand="0" w:noVBand="1" w:val="04A0"/>
       </w:tblPr>
       <w:tblGrid>
-        <w:gridCol w:w="3312"/>
-        <w:gridCol w:w="3312"/>
-        <w:gridCol w:w="3312"/>
+        <w:gridCol w:w="2484"/>
+        <w:gridCol w:w="2484"/>
+        <w:gridCol w:w="2484"/>
+        <w:gridCol w:w="2484"/>
       </w:tblGrid>
       <w:tr>
         <w:tc>
           <w:tcPr>
-            <w:tcW w:type="dxa" w:w="3312"/>
+            <w:tcW w:type="dxa" w:w="2484"/>
             <w:shd w:fill="F3D2EC"/>
           </w:tcPr>
           <w:p>
@@ -1435,7 +1445,7 @@
         </w:tc>
         <w:tc>
           <w:tcPr>
-            <w:tcW w:type="dxa" w:w="3312"/>
+            <w:tcW w:type="dxa" w:w="2484"/>
             <w:shd w:fill="F3D2EC"/>
           </w:tcPr>
           <w:p>
@@ -1444,13 +1454,13 @@
                 <w:b/>
                 <w:sz w:val="20"/>
               </w:rPr>
-              <w:t>Anúncios ativos</w:t>
+              <w:t>Venda direta</w:t>
             </w:r>
           </w:p>
         </w:tc>
         <w:tc>
           <w:tcPr>
-            <w:tcW w:type="dxa" w:w="3312"/>
+            <w:tcW w:type="dxa" w:w="2484"/>
             <w:shd w:fill="F3D2EC"/>
           </w:tcPr>
           <w:p>
@@ -1459,7 +1469,22 @@
                 <w:b/>
                 <w:sz w:val="20"/>
               </w:rPr>
-              <w:t>O que observar</w:t>
+              <w:t>Engajamento</w:t>
+            </w:r>
+          </w:p>
+        </w:tc>
+        <w:tc>
+          <w:tcPr>
+            <w:tcW w:type="dxa" w:w="2484"/>
+            <w:shd w:fill="F3D2EC"/>
+          </w:tcPr>
+          <w:p>
+            <w:r>
+              <w:rPr>
+                <w:b/>
+                <w:sz w:val="20"/>
+              </w:rPr>
+              <w:t>Tema em comum</w:t>
             </w:r>
           </w:p>
         </w:tc>
@@ -1467,7 +1492,7 @@
       <w:tr>
         <w:tc>
           <w:tcPr>
-            <w:tcW w:type="dxa" w:w="3312"/>
+            <w:tcW w:type="dxa" w:w="2484"/>
           </w:tcPr>
           <w:p>
             <w:r>
@@ -1475,13 +1500,13 @@
                 <w:b w:val="0"/>
                 <w:sz w:val="20"/>
               </w:rPr>
-              <w:t>20/07 a 02/08 (2 semanas)</w:t>
+              <w:t>Semana 1-2 (20/07 a 02/08)</w:t>
             </w:r>
           </w:p>
         </w:tc>
         <w:tc>
           <w:tcPr>
-            <w:tcW w:type="dxa" w:w="3312"/>
+            <w:tcW w:type="dxa" w:w="2484"/>
           </w:tcPr>
           <w:p>
             <w:r>
@@ -1489,13 +1514,13 @@
                 <w:b w:val="0"/>
                 <w:sz w:val="20"/>
               </w:rPr>
-              <w:t>Anúncio 1 (ciúme/relacionamentos) + Anúncio 2 (solidão)</w:t>
+              <w:t>Anúncio 1</w:t>
             </w:r>
           </w:p>
         </w:tc>
         <w:tc>
           <w:tcPr>
-            <w:tcW w:type="dxa" w:w="3312"/>
+            <w:tcW w:type="dxa" w:w="2484"/>
           </w:tcPr>
           <w:p>
             <w:r>
@@ -1503,7 +1528,21 @@
                 <w:b w:val="0"/>
                 <w:sz w:val="20"/>
               </w:rPr>
-              <w:t>Os dois ganchos de dor mais fortes primeiro. Rodar simultaneamente, dividindo a verba, e comparar custo por clique e por venda.</w:t>
+              <w:t>Feed B</w:t>
+            </w:r>
+          </w:p>
+        </w:tc>
+        <w:tc>
+          <w:tcPr>
+            <w:tcW w:type="dxa" w:w="2484"/>
+          </w:tcPr>
+          <w:p>
+            <w:r>
+              <w:rPr>
+                <w:b w:val="0"/>
+                <w:sz w:val="20"/>
+              </w:rPr>
+              <w:t>Ciúme e relacionamentos</w:t>
             </w:r>
           </w:p>
         </w:tc>
@@ -1511,7 +1550,7 @@
       <w:tr>
         <w:tc>
           <w:tcPr>
-            <w:tcW w:type="dxa" w:w="3312"/>
+            <w:tcW w:type="dxa" w:w="2484"/>
           </w:tcPr>
           <w:p>
             <w:r>
@@ -1519,13 +1558,13 @@
                 <w:b w:val="0"/>
                 <w:sz w:val="20"/>
               </w:rPr>
-              <w:t>03/08 a 16/08 (2 semanas)</w:t>
+              <w:t>Semana 3-4 (03/08 a 16/08)</w:t>
             </w:r>
           </w:p>
         </w:tc>
         <w:tc>
           <w:tcPr>
-            <w:tcW w:type="dxa" w:w="3312"/>
+            <w:tcW w:type="dxa" w:w="2484"/>
           </w:tcPr>
           <w:p>
             <w:r>
@@ -1533,13 +1572,13 @@
                 <w:b w:val="0"/>
                 <w:sz w:val="20"/>
               </w:rPr>
-              <w:t>Manter o vencedor da dupla anterior + Anúncio 3 (autocrítica/insuficiência)</w:t>
+              <w:t>Anúncio 3</w:t>
             </w:r>
           </w:p>
         </w:tc>
         <w:tc>
           <w:tcPr>
-            <w:tcW w:type="dxa" w:w="3312"/>
+            <w:tcW w:type="dxa" w:w="2484"/>
           </w:tcPr>
           <w:p>
             <w:r>
@@ -1547,7 +1586,21 @@
                 <w:b w:val="0"/>
                 <w:sz w:val="20"/>
               </w:rPr>
-              <w:t>Trocar o anúncio de pior desempenho pelo novo, manter o de melhor desempenho rodando.</w:t>
+              <w:t>Feed A</w:t>
+            </w:r>
+          </w:p>
+        </w:tc>
+        <w:tc>
+          <w:tcPr>
+            <w:tcW w:type="dxa" w:w="2484"/>
+          </w:tcPr>
+          <w:p>
+            <w:r>
+              <w:rPr>
+                <w:b w:val="0"/>
+                <w:sz w:val="20"/>
+              </w:rPr>
+              <w:t>Autocrítica e autoestima</w:t>
             </w:r>
           </w:p>
         </w:tc>
@@ -1555,7 +1608,7 @@
       <w:tr>
         <w:tc>
           <w:tcPr>
-            <w:tcW w:type="dxa" w:w="3312"/>
+            <w:tcW w:type="dxa" w:w="2484"/>
           </w:tcPr>
           <w:p>
             <w:r>
@@ -1563,13 +1616,13 @@
                 <w:b w:val="0"/>
                 <w:sz w:val="20"/>
               </w:rPr>
-              <w:t>17/08 a 30/08 (2 semanas)</w:t>
+              <w:t>Semana 5-6 (17/08 a 30/08)</w:t>
             </w:r>
           </w:p>
         </w:tc>
         <w:tc>
           <w:tcPr>
-            <w:tcW w:type="dxa" w:w="3312"/>
+            <w:tcW w:type="dxa" w:w="2484"/>
           </w:tcPr>
           <w:p>
             <w:r>
@@ -1577,13 +1630,13 @@
                 <w:b w:val="0"/>
                 <w:sz w:val="20"/>
               </w:rPr>
-              <w:t>Manter o melhor até aqui + testar Anúncio 4 (anulação/dizer não) ou Anúncio 5 (padrões repetidos), o que ainda não foi testado</w:t>
+              <w:t>Anúncio 5</w:t>
             </w:r>
           </w:p>
         </w:tc>
         <w:tc>
           <w:tcPr>
-            <w:tcW w:type="dxa" w:w="3312"/>
+            <w:tcW w:type="dxa" w:w="2484"/>
           </w:tcPr>
           <w:p>
             <w:r>
@@ -1591,13 +1644,36 @@
                 <w:b w:val="0"/>
                 <w:sz w:val="20"/>
               </w:rPr>
-              <w:t>Nessa altura já deve dar para visualizar qual dor converte melhor para o público dela, e isso orienta os próximos anúncios quando a verba aumentar.</w:t>
+              <w:t>Feed C</w:t>
+            </w:r>
+          </w:p>
+        </w:tc>
+        <w:tc>
+          <w:tcPr>
+            <w:tcW w:type="dxa" w:w="2484"/>
+          </w:tcPr>
+          <w:p>
+            <w:r>
+              <w:rPr>
+                <w:b w:val="0"/>
+                <w:sz w:val="20"/>
+              </w:rPr>
+              <w:t>Padrões repetidos e relacionamentos</w:t>
             </w:r>
           </w:p>
         </w:tc>
       </w:tr>
     </w:tbl>
     <w:p/>
+    <w:p>
+      <w:r>
+        <w:rPr>
+          <w:b w:val="0"/>
+          <w:sz w:val="22"/>
+        </w:rPr>
+        <w:t>Essa programação usa os Anúncios 1, 3 e 5 (venda direta) e os três vídeos de Feed (engajamento) dentro dessas 6 semanas. Os Anúncios 2 e 4 ficam de reserva, prontos para entrar quando a verba aumentar ou se algum par performar mal e precisar de substituto no meio do caminho.</w:t>
+      </w:r>
+    </w:p>
     <w:p>
       <w:r>
         <w:rPr>
@@ -1611,7 +1687,7 @@
           <w:b w:val="0"/>
           <w:sz w:val="22"/>
         </w:rPr>
-        <w:t xml:space="preserve"> nunca rodar mais de 2 anúncios simultâneos com R$15/dia. Verba dividida entre muitos criativos não gera dado suficiente para decidir nada. Assim que a verba subir, dá para testar 3-4 ao mesmo tempo.</w:t>
+        <w:t xml:space="preserve"> nunca rodar mais de 2 anúncios simultâneos com R$15/dia. Verba dividida entre muitos criativos não gera dado suficiente para decidir nada. Assim que a verba subir, dá para testar mais pares ao mesmo tempo.</w:t>
       </w:r>
     </w:p>
     <w:p>
@@ -1620,7 +1696,7 @@
           <w:b w:val="0"/>
           <w:sz w:val="22"/>
         </w:rPr>
-        <w:t>Os 3 vídeos de Feed não entram nessa verba paga: são conteúdo orgânico, podem ser publicados ao longo das mesmas semanas, espaçados entre si, para não competir por atenção com os reels do calendário de Instagram.</w:t>
+        <w:t>Rodar os vídeos de Feed também como anúncio pago (não só orgânico) ajuda em outro ponto do diagnóstico: a automação Youze só funciona bem com tráfego pago rodando, e assim ela já tem volume alimentando ela desde a semana 1.</w:t>
       </w:r>
     </w:p>
     <w:sectPr>

</xml_diff>